<commit_message>
Release 2.4: Clean white default theme, More menu, clearer fonts, better Find jobs
Co-Authored-By: Claude Sonnet 5.5 <noreply@anthropic.com>
</commit_message>
<xml_diff>
--- a/docs/Career_Hub_Guide.docx
+++ b/docs/Career_Hub_Guide.docx
@@ -1162,16 +1162,17 @@
           <w:sz w:val="22"/>
           <w:szCs w:val="22"/>
         </w:rPr>
-        <w:t xml:space="preserve">Shortcuts:</w:t>
-      </w:r>
-      <w:r>
-        <w:rPr>
-          <w:rFonts w:ascii="Arial" w:cs="Arial" w:eastAsia="Arial" w:hAnsi="Arial"/>
-          <w:color w:val="1F2937"/>
-          <w:sz w:val="22"/>
-          <w:szCs w:val="22"/>
-        </w:rPr>
-        <w:t xml:space="preserve"> press 1 to 6 to jump between pages, Ctrl+K (⌘K on Mac) for quick actions, Esc to close a panel. When the app asks a question with options, press the option's number.</w:t>
+        <w:t>Shortcuts:</w:t>
+      </w:r>
+      <w:r>
+        <w:rPr>
+          <w:rFonts w:ascii="Arial" w:cs="Arial" w:eastAsia="Arial" w:hAnsi="Arial"/>
+          <w:bCs/>
+          <w:color w:val="1F2937"/>
+          <w:sz w:val="22"/>
+          <w:szCs w:val="22"/>
+        </w:rPr>
+        <w:t xml:space="preserve"> press 1 to 6 to jump between pages, Ctrl+K (⌘K on Mac) for quick actions, Esc to close a panel. Quick actions, Activity and Report a problem are under More in the sidebar. When the app asks a question with options, press the option's number.</w:t>
       </w:r>
     </w:p>
     <w:p>
@@ -4914,38 +4915,36 @@
           <w:sz w:val="22"/>
           <w:szCs w:val="22"/>
         </w:rPr>
-        <w:t xml:space="preserve">Add companies or careers-page links. Keep </w:t>
+        <w:t xml:space="preserve">Keep </w:t>
       </w:r>
       <w:r>
         <w:rPr>
           <w:rFonts w:ascii="Arial" w:cs="Arial" w:eastAsia="Arial" w:hAnsi="Arial"/>
           <w:b/>
-          <w:bCs/>
-          <w:color w:val="1F2937"/>
-          <w:sz w:val="22"/>
-          <w:szCs w:val="22"/>
-        </w:rPr>
-        <w:t xml:space="preserve">Also search the web</w:t>
-      </w:r>
-      <w:r>
-        <w:rPr>
-          <w:rFonts w:ascii="Arial" w:cs="Arial" w:eastAsia="Arial" w:hAnsi="Arial"/>
-          <w:color w:val="1F2937"/>
-          <w:sz w:val="22"/>
-          <w:szCs w:val="22"/>
-        </w:rPr>
-        <w:t xml:space="preserve"> on to discover others. </w:t>
+          <w:color w:val="1F2937"/>
+          <w:sz w:val="22"/>
+          <w:szCs w:val="22"/>
+        </w:rPr>
+        <w:t>Companies that are hiring</w:t>
+      </w:r>
+      <w:r>
+        <w:rPr>
+          <w:rFonts w:ascii="Arial" w:cs="Arial" w:eastAsia="Arial" w:hAnsi="Arial"/>
+          <w:color w:val="1F2937"/>
+          <w:sz w:val="22"/>
+          <w:szCs w:val="22"/>
+        </w:rPr>
+        <w:t xml:space="preserve"> on: the app checks the job boards of many companies for you. Under it you can add your own companies (type a name, or paste a careers-page link). </w:t>
       </w:r>
       <w:r>
         <w:rPr>
           <w:rFonts w:ascii="Arial" w:cs="Arial" w:eastAsia="Arial" w:hAnsi="Arial"/>
           <w:b/>
-          <w:bCs/>
-          <w:color w:val="1F2937"/>
-          <w:sz w:val="22"/>
-          <w:szCs w:val="22"/>
-        </w:rPr>
-        <w:t xml:space="preserve">Repeat this search daily</w:t>
+          <w:color w:val="1F2937"/>
+          <w:sz w:val="22"/>
+          <w:szCs w:val="22"/>
+        </w:rPr>
+        <w:t>Repeat this search daily</w:t>
       </w:r>
       <w:r>
         <w:rPr>
@@ -5633,7 +5632,7 @@
           <w:sz w:val="22"/>
           <w:szCs w:val="22"/>
         </w:rPr>
-        <w:t xml:space="preserve">Settings, Appearance: choose Match my computer, Light or Dark, and a colour theme. Or press Ctrl+K (⌘K on Mac) and type "dark".</w:t>
+        <w:t>Settings, Appearance: choose a colour theme. Clean white (white pages with a charcoal side panel) is the default; Sand, Emerald, Slate and Mint are the others. Or press Ctrl+K (⌘K on Mac) and type "theme".</w:t>
       </w:r>
     </w:p>
     <w:p>
@@ -5945,27 +5944,45 @@
           <w:sz w:val="22"/>
           <w:szCs w:val="22"/>
         </w:rPr>
-        <w:t xml:space="preserve">Click </w:t>
+        <w:t xml:space="preserve">Open </w:t>
       </w:r>
       <w:r>
         <w:rPr>
           <w:rFonts w:ascii="Arial" w:cs="Arial" w:eastAsia="Arial" w:hAnsi="Arial"/>
           <w:b/>
-          <w:bCs/>
-          <w:color w:val="1F2937"/>
-          <w:sz w:val="22"/>
-          <w:szCs w:val="22"/>
-        </w:rPr>
-        <w:t xml:space="preserve">Report a problem</w:t>
-      </w:r>
-      <w:r>
-        <w:rPr>
-          <w:rFonts w:ascii="Arial" w:cs="Arial" w:eastAsia="Arial" w:hAnsi="Arial"/>
-          <w:color w:val="1F2937"/>
-          <w:sz w:val="22"/>
-          <w:szCs w:val="22"/>
-        </w:rPr>
-        <w:t xml:space="preserve"> in the sidebar, write a short note, and send. Your helper gets an email with the activity log and screenshots. Passwords and keys are never included.</w:t>
+          <w:color w:val="1F2937"/>
+          <w:sz w:val="22"/>
+          <w:szCs w:val="22"/>
+        </w:rPr>
+        <w:t>More</w:t>
+      </w:r>
+      <w:r>
+        <w:rPr>
+          <w:rFonts w:ascii="Arial" w:cs="Arial" w:eastAsia="Arial" w:hAnsi="Arial"/>
+          <w:color w:val="1F2937"/>
+          <w:sz w:val="22"/>
+          <w:szCs w:val="22"/>
+        </w:rPr>
+        <w:t xml:space="preserve"> at the bottom of the sidebar, click </w:t>
+      </w:r>
+      <w:r>
+        <w:rPr>
+          <w:rFonts w:ascii="Arial" w:cs="Arial" w:eastAsia="Arial" w:hAnsi="Arial"/>
+          <w:b/>
+          <w:color w:val="1F2937"/>
+          <w:sz w:val="22"/>
+          <w:szCs w:val="22"/>
+        </w:rPr>
+        <w:t>Report a problem</w:t>
+      </w:r>
+      <w:r>
+        <w:rPr>
+          <w:rFonts w:ascii="Arial" w:cs="Arial" w:eastAsia="Arial" w:hAnsi="Arial"/>
+          <w:color w:val="1F2937"/>
+          <w:sz w:val="22"/>
+          <w:szCs w:val="22"/>
+        </w:rPr>
+        <w:t>, write a short note, and send. Your helper gets an email with the activity log and screenshots. Passwords and keys are never included.</w:t>
       </w:r>
     </w:p>
     <w:p>
@@ -8365,7 +8382,7 @@
         <w:sz w:val="18"/>
         <w:szCs w:val="18"/>
       </w:rPr>
-      <w:t xml:space="preserve">Harshitha's Career Hub · Guide (v2.3)</w:t>
+      <w:t xml:space="preserve">Harshitha's Career Hub · Guide (v2.4)</w:t>
     </w:r>
   </w:p>
 </w:hdr>

</xml_diff>

<commit_message>
Release 2.5: calendar, to-do, hourly Gmail check, interview dates from email, motivation note
Co-Authored-By: Claude Sonnet 5.5 <noreply@anthropic.com>
</commit_message>
<xml_diff>
--- a/docs/Career_Hub_Guide.docx
+++ b/docs/Career_Hub_Guide.docx
@@ -5283,6 +5283,62 @@
     </w:p>
     <w:p>
       <w:pPr>
+        <w:spacing w:after="120" w:line="300"/>
+      </w:pPr>
+      <w:r>
+        <w:rPr>
+          <w:rFonts w:ascii="Arial" w:cs="Arial" w:eastAsia="Arial" w:hAnsi="Arial"/>
+          <w:color w:val="1F2937"/>
+          <w:sz w:val="22"/>
+          <w:szCs w:val="22"/>
+        </w:rPr>
+        <w:t>The app reads your job Gmail by itself when it opens and then every hour. Press Check email to do it right now: a spinning circle shows while it works.</w:t>
+      </w:r>
+    </w:p>
+    <w:p>
+      <w:pPr>
+        <w:spacing w:after="120" w:line="300"/>
+      </w:pPr>
+      <w:r>
+        <w:rPr>
+          <w:rFonts w:ascii="Arial" w:cs="Arial" w:eastAsia="Arial" w:hAnsi="Arial"/>
+          <w:color w:val="1F2937"/>
+          <w:sz w:val="22"/>
+          <w:szCs w:val="22"/>
+        </w:rPr>
+        <w:t>Calendar: when an interview email gives a date, it appears on the calendar by itself (marked "from your email"). Add one yourself with + Add interview, or press the small calendar button on an interview in Needs you. Click a day to see what is on it.</w:t>
+      </w:r>
+    </w:p>
+    <w:p>
+      <w:pPr>
+        <w:spacing w:after="120" w:line="300"/>
+      </w:pPr>
+      <w:r>
+        <w:rPr>
+          <w:rFonts w:ascii="Arial" w:cs="Arial" w:eastAsia="Arial" w:hAnsi="Arial"/>
+          <w:color w:val="1F2937"/>
+          <w:sz w:val="22"/>
+          <w:szCs w:val="22"/>
+        </w:rPr>
+        <w:t>To-do: type a reminder and press Enter. Tick it when done, and Clear done removes the ticked ones.</w:t>
+      </w:r>
+    </w:p>
+    <w:p>
+      <w:pPr>
+        <w:spacing w:after="120" w:line="300"/>
+      </w:pPr>
+      <w:r>
+        <w:rPr>
+          <w:rFonts w:ascii="Arial" w:cs="Arial" w:eastAsia="Arial" w:hAnsi="Arial"/>
+          <w:color w:val="1F2937"/>
+          <w:sz w:val="22"/>
+          <w:szCs w:val="22"/>
+        </w:rPr>
+        <w:t>After more than 6 rejection emails, the app shows a kind note. Every no is part of a job search, so keep going.</w:t>
+      </w:r>
+    </w:p>
+    <w:p>
+      <w:pPr>
         <w:pStyle w:val="Heading2"/>
         <w:keepNext/>
         <w:spacing w:after="100" w:before="280"/>
@@ -5326,7 +5382,7 @@
           <w:sz w:val="22"/>
           <w:szCs w:val="22"/>
         </w:rPr>
-        <w:t xml:space="preserve">Each column is a stage. Cards move by themselves when emails arrive.</w:t>
+        <w:t>Each column is a stage. Cards move by themselves when emails arrive.</w:t>
       </w:r>
     </w:p>
     <w:p>
@@ -8382,7 +8438,7 @@
         <w:sz w:val="18"/>
         <w:szCs w:val="18"/>
       </w:rPr>
-      <w:t xml:space="preserve">Harshitha's Career Hub · Guide (v2.4.1)</w:t>
+      <w:t xml:space="preserve">Harshitha's Career Hub · Guide (v2.5)</w:t>
     </w:r>
   </w:p>
 </w:hdr>

</xml_diff>

<commit_message>
Release 2.6: Workday work history and education, time zones and reschedules for interview emails
Co-Authored-By: Claude Sonnet 5.5 <noreply@anthropic.com>
</commit_message>
<xml_diff>
--- a/docs/Career_Hub_Guide.docx
+++ b/docs/Career_Hub_Guide.docx
@@ -2422,6 +2422,20 @@
     </w:p>
     <w:p>
       <w:pPr>
+        <w:spacing w:after="120" w:line="300"/>
+      </w:pPr>
+      <w:r>
+        <w:rPr>
+          <w:rFonts w:ascii="Arial" w:cs="Arial" w:eastAsia="Arial" w:hAnsi="Arial"/>
+          <w:color w:val="1F2937"/>
+          <w:sz w:val="22"/>
+          <w:szCs w:val="22"/>
+        </w:rPr>
+        <w:t>Work and education: in Profile, open Work and education and press Read from my resume. Check each job and degree, fix anything wrong, then press Save. Sites like Workday ask for these one by one, and the app adds them for you.</w:t>
+      </w:r>
+    </w:p>
+    <w:p>
+      <w:pPr>
         <w:spacing w:after="160" w:before="120"/>
         <w:jc w:val="center"/>
       </w:pPr>
@@ -8438,7 +8452,7 @@
         <w:sz w:val="18"/>
         <w:szCs w:val="18"/>
       </w:rPr>
-      <w:t xml:space="preserve">Harshitha's Career Hub · Guide (v2.5.1)</w:t>
+      <w:t xml:space="preserve">Harshitha's Career Hub · Guide (v2.6)</w:t>
     </w:r>
   </w:p>
 </w:hdr>

</xml_diff>

<commit_message>
Release 2.6.1: Updates button in the side menu, update source set automatically
Co-Authored-By: Claude Sonnet 5.5 <noreply@anthropic.com>
</commit_message>
<xml_diff>
--- a/docs/Career_Hub_Guide.docx
+++ b/docs/Career_Hub_Guide.docx
@@ -6253,7 +6253,7 @@
           <w:sz w:val="22"/>
           <w:szCs w:val="22"/>
         </w:rPr>
-        <w:t xml:space="preserve">Every version is listed in Settings, What's new. No internet at that moment? </w:t>
+        <w:t>Every version is listed in Settings, What's new. No internet at that moment? Press Updates at the bottom of the left menu (or Check for updates in Settings) to try again. A small "new" tag appears there when an update is waiting.</w:t>
       </w:r>
       <w:r>
         <w:rPr>
@@ -6264,16 +6264,14 @@
           <w:sz w:val="22"/>
           <w:szCs w:val="22"/>
         </w:rPr>
-        <w:t xml:space="preserve">Check for updates</w:t>
-      </w:r>
-      <w:r>
-        <w:rPr>
-          <w:rFonts w:ascii="Arial" w:cs="Arial" w:eastAsia="Arial" w:hAnsi="Arial"/>
-          <w:color w:val="1F2937"/>
-          <w:sz w:val="22"/>
-          <w:szCs w:val="22"/>
-        </w:rPr>
-        <w:t xml:space="preserve"> in Settings tries again.</w:t>
+      </w:r>
+      <w:r>
+        <w:rPr>
+          <w:rFonts w:ascii="Arial" w:cs="Arial" w:eastAsia="Arial" w:hAnsi="Arial"/>
+          <w:color w:val="1F2937"/>
+          <w:sz w:val="22"/>
+          <w:szCs w:val="22"/>
+        </w:rPr>
       </w:r>
     </w:p>
     <w:p>
@@ -8452,7 +8450,7 @@
         <w:sz w:val="18"/>
         <w:szCs w:val="18"/>
       </w:rPr>
-      <w:t xml:space="preserve">Harshitha's Career Hub · Guide (v2.6)</w:t>
+      <w:t xml:space="preserve">Harshitha's Career Hub · Guide (v2.6.1)</w:t>
     </w:r>
   </w:p>
 </w:hdr>

</xml_diff>

<commit_message>
Release 2.6.8: filters on Find jobs, Apply list and My jobs
Co-Authored-By: Claude Sonnet 5.5 <noreply@anthropic.com>
</commit_message>
<xml_diff>
--- a/docs/Career_Hub_Guide.docx
+++ b/docs/Career_Hub_Guide.docx
@@ -5031,6 +5031,25 @@
     </w:p>
     <w:p>
       <w:pPr>
+        <w:pStyle w:val="ListParagraph"/>
+        <w:numPr>
+          <w:ilvl w:val="0"/>
+          <w:numId w:val="3"/>
+        </w:numPr>
+        <w:spacing w:after="80" w:line="290"/>
+      </w:pPr>
+      <w:r>
+        <w:rPr>
+          <w:rFonts w:ascii="Arial" w:cs="Arial" w:eastAsia="Arial" w:hAnsi="Arial"/>
+          <w:color w:val="1F2937"/>
+          <w:sz w:val="22"/>
+          <w:szCs w:val="22"/>
+        </w:rPr>
+        <w:t>Too many results? Use the filter box, the date and match lists, and the sort list above the results. Select all only picks what is showing. The Apply list has a filter box too.</w:t>
+      </w:r>
+    </w:p>
+    <w:p>
+      <w:pPr>
         <w:spacing w:after="120" w:line="300"/>
       </w:pPr>
       <w:r>
@@ -5453,6 +5472,25 @@
           <w:sz w:val="22"/>
           <w:szCs w:val="22"/>
         </w:rPr>
+        <w:t>Use the search box and the stage list above the board to narrow it down. Search also works on Emails, Accounts and Found.</w:t>
+      </w:r>
+    </w:p>
+    <w:p>
+      <w:pPr>
+        <w:pStyle w:val="ListParagraph"/>
+        <w:numPr>
+          <w:ilvl w:val="0"/>
+          <w:numId w:val="3"/>
+        </w:numPr>
+        <w:spacing w:after="80" w:line="290"/>
+      </w:pPr>
+      <w:r>
+        <w:rPr>
+          <w:rFonts w:ascii="Arial" w:cs="Arial" w:eastAsia="Arial" w:hAnsi="Arial"/>
+          <w:color w:val="1F2937"/>
+          <w:sz w:val="22"/>
+          <w:szCs w:val="22"/>
+        </w:rPr>
         <w:t xml:space="preserve">The tabs at the top switch to a List, all Emails, your job-site Accounts (passwords hidden until you click Show) and Found jobs. </w:t>
       </w:r>
       <w:r>
@@ -8450,7 +8488,7 @@
         <w:sz w:val="18"/>
         <w:szCs w:val="18"/>
       </w:rPr>
-      <w:t xml:space="preserve">Harshitha's Career Hub · Guide (v2.6.6)</w:t>
+      <w:t>Harshitha's Career Hub · Guide (v2.6.8)</w:t>
     </w:r>
   </w:p>
 </w:hdr>

</xml_diff>

<commit_message>
Release 2.6.15: separate cards for LinkedIn rejections, extra inboxes, show more emails
Co-Authored-By: Claude Sonnet 5.5 <noreply@anthropic.com>
</commit_message>
<xml_diff>
--- a/docs/Career_Hub_Guide.docx
+++ b/docs/Career_Hub_Guide.docx
@@ -2601,6 +2601,25 @@
     </w:p>
     <w:p>
       <w:pPr>
+        <w:pStyle w:val="ListParagraph"/>
+        <w:numPr>
+          <w:ilvl w:val="0"/>
+          <w:numId w:val="4"/>
+        </w:numPr>
+        <w:spacing w:after="80" w:line="290"/>
+      </w:pPr>
+      <w:r>
+        <w:rPr>
+          <w:rFonts w:ascii="Arial" w:cs="Arial" w:eastAsia="Arial" w:hAnsi="Arial"/>
+          <w:color w:val="1F2937"/>
+          <w:sz w:val="22"/>
+          <w:szCs w:val="22"/>
+        </w:rPr>
+        <w:t>Optional: a second or third job Gmail can be added in the same place (each needs its own app password). The app reads all of them.</w:t>
+      </w:r>
+    </w:p>
+    <w:p>
+      <w:pPr>
         <w:spacing w:after="160" w:before="120"/>
         <w:jc w:val="center"/>
       </w:pPr>
@@ -5325,7 +5344,7 @@
           <w:sz w:val="22"/>
           <w:szCs w:val="22"/>
         </w:rPr>
-        <w:t>The app reads your job Gmail by itself when it opens and then every hour. Press Check email to do it right now: a spinning circle shows while it works.</w:t>
+        <w:t>The app reads your job Gmail by itself when it opens and then every hour. Press Check email to do it right now: a spinning circle shows while it works. Home shows the latest 8 emails; See all opens the full list, 25 at a time.</w:t>
       </w:r>
     </w:p>
     <w:p>
@@ -8488,7 +8507,7 @@
         <w:sz w:val="18"/>
         <w:szCs w:val="18"/>
       </w:rPr>
-      <w:t>Harshitha's Career Hub · Guide (v2.6.14)</w:t>
+      <w:t>Harshitha's Career Hub · Guide (v2.6.15)</w:t>
     </w:r>
   </w:p>
 </w:hdr>

</xml_diff>

<commit_message>
Release 2.6.16: Waiting for reply and No response columns
Co-Authored-By: Claude Sonnet 5.5 <noreply@anthropic.com>
</commit_message>
<xml_diff>
--- a/docs/Career_Hub_Guide.docx
+++ b/docs/Career_Hub_Guide.docx
@@ -5472,6 +5472,44 @@
           <w:sz w:val="22"/>
           <w:szCs w:val="22"/>
         </w:rPr>
+        <w:t>Waiting for reply: an interview card moves here by itself once the interview date has passed, so you can see who still owes you an answer.</w:t>
+      </w:r>
+    </w:p>
+    <w:p>
+      <w:pPr>
+        <w:pStyle w:val="ListParagraph"/>
+        <w:numPr>
+          <w:ilvl w:val="0"/>
+          <w:numId w:val="3"/>
+        </w:numPr>
+        <w:spacing w:after="80" w:line="290"/>
+      </w:pPr>
+      <w:r>
+        <w:rPr>
+          <w:rFonts w:ascii="Arial" w:cs="Arial" w:eastAsia="Arial" w:hAnsi="Arial"/>
+          <w:color w:val="1F2937"/>
+          <w:sz w:val="22"/>
+          <w:szCs w:val="22"/>
+        </w:rPr>
+        <w:t>No response: a job you applied to 30 or more days ago, with no reply at all, moves here by itself. Drag it back if you still want to follow it up.</w:t>
+      </w:r>
+    </w:p>
+    <w:p>
+      <w:pPr>
+        <w:pStyle w:val="ListParagraph"/>
+        <w:numPr>
+          <w:ilvl w:val="0"/>
+          <w:numId w:val="3"/>
+        </w:numPr>
+        <w:spacing w:after="80" w:line="290"/>
+      </w:pPr>
+      <w:r>
+        <w:rPr>
+          <w:rFonts w:ascii="Arial" w:cs="Arial" w:eastAsia="Arial" w:hAnsi="Arial"/>
+          <w:color w:val="1F2937"/>
+          <w:sz w:val="22"/>
+          <w:szCs w:val="22"/>
+        </w:rPr>
         <w:t xml:space="preserve">Click a card for its details: stage, links to the job and the latest email, your notes (saved as you type) and every email about that job.</w:t>
       </w:r>
     </w:p>
@@ -8507,7 +8545,7 @@
         <w:sz w:val="18"/>
         <w:szCs w:val="18"/>
       </w:rPr>
-      <w:t>Harshitha's Career Hub · Guide (v2.6.15)</w:t>
+      <w:t>Harshitha's Career Hub · Guide (v2.6.16)</w:t>
     </w:r>
   </w:p>
 </w:hdr>

</xml_diff>

<commit_message>
Release 2.7.4: Settings shows your reports and ideas with their status
Co-Authored-By: Claude Sonnet 5.5 <noreply@anthropic.com>
</commit_message>
<xml_diff>
--- a/docs/Career_Hub_Guide.docx
+++ b/docs/Career_Hub_Guide.docx
@@ -6171,6 +6171,44 @@
     </w:p>
     <w:p>
       <w:pPr>
+        <w:pStyle w:val="ListParagraph"/>
+        <w:numPr>
+          <w:ilvl w:val="0"/>
+          <w:numId w:val="3"/>
+        </w:numPr>
+        <w:spacing w:after="80" w:line="290"/>
+      </w:pPr>
+      <w:r>
+        <w:rPr>
+          <w:rFonts w:ascii="Arial" w:cs="Arial" w:eastAsia="Arial" w:hAnsi="Arial"/>
+          <w:color w:val="1F2937"/>
+          <w:sz w:val="22"/>
+          <w:szCs w:val="22"/>
+        </w:rPr>
+        <w:t xml:space="preserve">Got an idea? Open More, click Suggest a feature, describe what you wish the app could do, and send. It goes straight to your helper.</w:t>
+      </w:r>
+    </w:p>
+    <w:p>
+      <w:pPr>
+        <w:pStyle w:val="ListParagraph"/>
+        <w:numPr>
+          <w:ilvl w:val="0"/>
+          <w:numId w:val="3"/>
+        </w:numPr>
+        <w:spacing w:after="80" w:line="290"/>
+      </w:pPr>
+      <w:r>
+        <w:rPr>
+          <w:rFonts w:ascii="Arial" w:cs="Arial" w:eastAsia="Arial" w:hAnsi="Arial"/>
+          <w:color w:val="1F2937"/>
+          <w:sz w:val="22"/>
+          <w:szCs w:val="22"/>
+        </w:rPr>
+        <w:t xml:space="preserve">To see what happened to what you sent, open Settings and look at Your reports and ideas. Each one shows Open, Done or Won't do, with a View link.</w:t>
+      </w:r>
+    </w:p>
+    <w:p>
+      <w:pPr>
         <w:spacing w:after="160" w:before="120"/>
         <w:jc w:val="center"/>
       </w:pPr>
@@ -8545,7 +8583,7 @@
         <w:sz w:val="18"/>
         <w:szCs w:val="18"/>
       </w:rPr>
-      <w:t>Harshitha's Career Hub · Guide (v2.7.2)</w:t>
+      <w:t>Harshitha's Career Hub · Guide (v2.7.4)</w:t>
     </w:r>
   </w:p>
 </w:hdr>

</xml_diff>

<commit_message>
Release 2.7.6: company search, board count fix, steadier browser login
Co-Authored-By: Claude Sonnet 5.5 <noreply@anthropic.com>
</commit_message>
<xml_diff>
--- a/docs/Career_Hub_Guide.docx
+++ b/docs/Career_Hub_Guide.docx
@@ -4967,7 +4967,7 @@
           <w:sz w:val="22"/>
           <w:szCs w:val="22"/>
         </w:rPr>
-        <w:t xml:space="preserve"> on: the app checks the job boards of many companies for you. Under it you can add your own companies (type a name, or paste a careers-page link). </w:t>
+        <w:t xml:space="preserve"> on: the app checks the job boards of many companies for you. Under it you can add your own companies (type a name, or paste a careers-page link). To see every opening at a company, tick Show every opening at these companies: your job titles, cities and minimum match are then ignored, and the web search is off. </w:t>
       </w:r>
       <w:r>
         <w:rPr>
@@ -8583,7 +8583,7 @@
         <w:sz w:val="18"/>
         <w:szCs w:val="18"/>
       </w:rPr>
-      <w:t>Harshitha's Career Hub · Guide (v2.7.4)</w:t>
+      <w:t>Harshitha's Career Hub · Guide (v2.7.6)</w:t>
     </w:r>
   </w:p>
 </w:hdr>

</xml_diff>

<commit_message>
Release 2.8.0: faster app, weekly summary, duplicate-job warning, interview prep
Co-Authored-By: Claude Sonnet 5.5 <noreply@anthropic.com>
</commit_message>
<xml_diff>
--- a/docs/Career_Hub_Guide.docx
+++ b/docs/Career_Hub_Guide.docx
@@ -5069,6 +5069,25 @@
     </w:p>
     <w:p>
       <w:pPr>
+        <w:pStyle w:val="ListParagraph"/>
+        <w:numPr>
+          <w:ilvl w:val="0"/>
+          <w:numId w:val="3"/>
+        </w:numPr>
+        <w:spacing w:after="80" w:line="290"/>
+      </w:pPr>
+      <w:r>
+        <w:rPr>
+          <w:rFonts w:ascii="Arial" w:cs="Arial" w:eastAsia="Arial" w:hAnsi="Arial"/>
+          <w:color w:val="1F2937"/>
+          <w:sz w:val="22"/>
+          <w:szCs w:val="22"/>
+        </w:rPr>
+        <w:t>If a job is one you already applied to through another link, the result says so in red and starts unticked, so you don't apply twice.</w:t>
+      </w:r>
+    </w:p>
+    <w:p>
+      <w:pPr>
         <w:spacing w:after="120" w:line="300"/>
       </w:pPr>
       <w:r>
@@ -5372,6 +5391,20 @@
           <w:sz w:val="22"/>
           <w:szCs w:val="22"/>
         </w:rPr>
+        <w:t>Your last 7 days: below the funnel, a small summary shows applications sent (compared with the week before), replies, interviews or tests and offers, with a bar chart of the last 8 weeks. It also tells you when applications have had no reply for a week, so you can send a short follow-up.</w:t>
+      </w:r>
+    </w:p>
+    <w:p>
+      <w:pPr>
+        <w:spacing w:after="120" w:line="300"/>
+      </w:pPr>
+      <w:r>
+        <w:rPr>
+          <w:rFonts w:ascii="Arial" w:cs="Arial" w:eastAsia="Arial" w:hAnsi="Arial"/>
+          <w:color w:val="1F2937"/>
+          <w:sz w:val="22"/>
+          <w:szCs w:val="22"/>
+        </w:rPr>
         <w:t>To-do: type a reminder and press Enter. Tick it when done, and Clear done removes the ticked ones.</w:t>
       </w:r>
     </w:p>
@@ -5511,6 +5544,25 @@
           <w:szCs w:val="22"/>
         </w:rPr>
         <w:t xml:space="preserve">Click a card for its details: stage, links to the job and the latest email, your notes (saved as you type) and every email about that job.</w:t>
+      </w:r>
+    </w:p>
+    <w:p>
+      <w:pPr>
+        <w:pStyle w:val="ListParagraph"/>
+        <w:numPr>
+          <w:ilvl w:val="0"/>
+          <w:numId w:val="3"/>
+        </w:numPr>
+        <w:spacing w:after="80" w:line="290"/>
+      </w:pPr>
+      <w:r>
+        <w:rPr>
+          <w:rFonts w:ascii="Arial" w:cs="Arial" w:eastAsia="Arial" w:hAnsi="Arial"/>
+          <w:color w:val="1F2937"/>
+          <w:sz w:val="22"/>
+          <w:szCs w:val="22"/>
+        </w:rPr>
+        <w:t>Interview or Test cards show a Get ready box: the date and time, a checklist, and (with the AI helper on) Get prep tips, which writes likely questions, talking points from your resume and questions to ask. Add tips to my notes saves them on the card.</w:t>
       </w:r>
     </w:p>
     <w:p>
@@ -8583,7 +8635,7 @@
         <w:sz w:val="18"/>
         <w:szCs w:val="18"/>
       </w:rPr>
-      <w:t>Harshitha's Career Hub · Guide (v2.7.7)</w:t>
+      <w:t>Harshitha's Career Hub · Guide (v2.8.0)</w:t>
     </w:r>
   </w:p>
 </w:hdr>

</xml_diff>

<commit_message>
Release 2.8.1: Check email shows scanned/read counts, faster first check
Co-Authored-By: Claude Sonnet 5.5 <noreply@anthropic.com>
</commit_message>
<xml_diff>
--- a/docs/Career_Hub_Guide.docx
+++ b/docs/Career_Hub_Guide.docx
@@ -5363,7 +5363,7 @@
           <w:sz w:val="22"/>
           <w:szCs w:val="22"/>
         </w:rPr>
-        <w:t>The app reads your job Gmail by itself when it opens and then every hour. Press Check email to do it right now: a spinning circle shows while it works. Home shows the latest 8 emails; See all opens the full list, 25 at a time.</w:t>
+        <w:t>The app reads your job Gmail by itself when it opens and then every hour. Press Check email to do it right now: a spinning circle shows while it works, with a count of the emails it has scanned and read. Home shows the latest 8 emails; See all opens the full list, 25 at a time.</w:t>
       </w:r>
     </w:p>
     <w:p>
@@ -8635,7 +8635,7 @@
         <w:sz w:val="18"/>
         <w:szCs w:val="18"/>
       </w:rPr>
-      <w:t>Harshitha's Career Hub · Guide (v2.8.0)</w:t>
+      <w:t>Harshitha's Career Hub · Guide (v2.8.1)</w:t>
     </w:r>
   </w:p>
 </w:hdr>

</xml_diff>

<commit_message>
Release 3.0: friendlier look, Chrome alerts, Today line, interview reminders
- What's new for 3.0 covers every change merged since 2.8.5 (look, Chrome alerts,
  Today line, daily limits, simpler Find jobs, Next up, reminders, interview details,
  her bug reports #10, #11, #14-#17, window closes on exit)
- Docs: MAP.md, CLAUDE.md, user guide (docx + PDF) updated for 3.0
- release.json signed for 3.0

Co-Authored-By: Claude Opus 5.5 <noreply@anthropic.com>
</commit_message>
<xml_diff>
--- a/docs/Career_Hub_Guide.docx
+++ b/docs/Career_Hub_Guide.docx
@@ -3160,7 +3160,7 @@
           <w:sz w:val="22"/>
           <w:szCs w:val="22"/>
         </w:rPr>
-        <w:t xml:space="preserve">A separate Chrome window opens with the job (it has a small purple label at the bottom-left). The app clicks Apply, signs in or creates your account, and fills page after page. A bar at the top shows which job it's on; </w:t>
+        <w:t>A separate Chrome window opens with the job (it has a small purple label at the bottom-left). The app clicks Apply, signs in or creates your account, and fills page after page. A bar at the top shows which job it's on; Stop ends the run any time without sending anything. When the app needs you in Chrome (a robot check, signing in, a captcha, or before Submit), the Chrome window jumps to the front and you hear a sound. If you are away, it reminds you again after a few minutes.</w:t>
       </w:r>
       <w:r>
         <w:rPr>
@@ -3171,16 +3171,14 @@
           <w:sz w:val="22"/>
           <w:szCs w:val="22"/>
         </w:rPr>
-        <w:t xml:space="preserve">Stop</w:t>
-      </w:r>
-      <w:r>
-        <w:rPr>
-          <w:rFonts w:ascii="Arial" w:cs="Arial" w:eastAsia="Arial" w:hAnsi="Arial"/>
-          <w:color w:val="1F2937"/>
-          <w:sz w:val="22"/>
-          <w:szCs w:val="22"/>
-        </w:rPr>
-        <w:t xml:space="preserve"> ends the run any time without sending anything.</w:t>
+      </w:r>
+      <w:r>
+        <w:rPr>
+          <w:rFonts w:ascii="Arial" w:cs="Arial" w:eastAsia="Arial" w:hAnsi="Arial"/>
+          <w:color w:val="1F2937"/>
+          <w:sz w:val="22"/>
+          <w:szCs w:val="22"/>
+        </w:rPr>
       </w:r>
     </w:p>
     <w:p>
@@ -4312,7 +4310,7 @@
           <w:sz w:val="22"/>
           <w:szCs w:val="22"/>
         </w:rPr>
-        <w:t xml:space="preserve">You can paste LinkedIn, Indeed and Naukri job links into Apply like any other link. To keep your accounts safe, the app follows these rules by itself:</w:t>
+        <w:t>You can paste LinkedIn, Indeed and Naukri job links into Apply like any other link. Under your job list, the Apply page shows how many applications are left today on each site (for example "LinkedIn: 7 of 10 left today"). To keep your accounts safe, the app follows these rules by itself:</w:t>
       </w:r>
     </w:p>
     <w:tbl>
@@ -4948,7 +4946,7 @@
           <w:sz w:val="22"/>
           <w:szCs w:val="22"/>
         </w:rPr>
-        <w:t xml:space="preserve">Keep </w:t>
+        <w:t>Choose where to search. Find jobs for me (the easiest) checks the job pages of many companies for roles that fit your resume and cities. Only companies I choose looks only at the companies you add: type a name and press Enter, or paste a careers-page link. Some companies, like Swiggy or Zomato, use their own job website, which the app can't read; the note above the results names them. Tick Show all their openings to see every job there, not only the ones that fit you. Repeat this search daily runs it again each day when you open the app.</w:t>
       </w:r>
       <w:r>
         <w:rPr>
@@ -4958,16 +4956,14 @@
           <w:sz w:val="22"/>
           <w:szCs w:val="22"/>
         </w:rPr>
-        <w:t>Companies that are hiring</w:t>
-      </w:r>
-      <w:r>
-        <w:rPr>
-          <w:rFonts w:ascii="Arial" w:cs="Arial" w:eastAsia="Arial" w:hAnsi="Arial"/>
-          <w:color w:val="1F2937"/>
-          <w:sz w:val="22"/>
-          <w:szCs w:val="22"/>
-        </w:rPr>
-        <w:t xml:space="preserve"> on: the app checks the job boards of many companies for you. Under it you can add your own companies (type a name, or paste a careers-page link). To see every opening at a company, tick Show every opening at these companies: your job titles, cities and minimum match are then ignored, and the web search is off. </w:t>
+      </w:r>
+      <w:r>
+        <w:rPr>
+          <w:rFonts w:ascii="Arial" w:cs="Arial" w:eastAsia="Arial" w:hAnsi="Arial"/>
+          <w:color w:val="1F2937"/>
+          <w:sz w:val="22"/>
+          <w:szCs w:val="22"/>
+        </w:rPr>
       </w:r>
       <w:r>
         <w:rPr>
@@ -4977,16 +4973,14 @@
           <w:sz w:val="22"/>
           <w:szCs w:val="22"/>
         </w:rPr>
-        <w:t>Repeat this search daily</w:t>
-      </w:r>
-      <w:r>
-        <w:rPr>
-          <w:rFonts w:ascii="Arial" w:cs="Arial" w:eastAsia="Arial" w:hAnsi="Arial"/>
-          <w:color w:val="1F2937"/>
-          <w:sz w:val="22"/>
-          <w:szCs w:val="22"/>
-        </w:rPr>
-        <w:t xml:space="preserve"> runs it again each day when you open the app.</w:t>
+      </w:r>
+      <w:r>
+        <w:rPr>
+          <w:rFonts w:ascii="Arial" w:cs="Arial" w:eastAsia="Arial" w:hAnsi="Arial"/>
+          <w:color w:val="1F2937"/>
+          <w:sz w:val="22"/>
+          <w:szCs w:val="22"/>
+        </w:rPr>
       </w:r>
     </w:p>
     <w:p>
@@ -5005,7 +4999,7 @@
           <w:sz w:val="22"/>
           <w:szCs w:val="22"/>
         </w:rPr>
-        <w:t xml:space="preserve">Each result has a match ring: how well it fits your resume. Untick what you don't want, then </w:t>
+        <w:t>After a search you see only what that search found; a link above the results shows the jobs found before. Each result has a match ring: how well it fits your resume. Untick what you don't want, then Apply now or Save for later.</w:t>
       </w:r>
       <w:r>
         <w:rPr>
@@ -5016,16 +5010,14 @@
           <w:sz w:val="22"/>
           <w:szCs w:val="22"/>
         </w:rPr>
-        <w:t xml:space="preserve">Apply now</w:t>
-      </w:r>
-      <w:r>
-        <w:rPr>
-          <w:rFonts w:ascii="Arial" w:cs="Arial" w:eastAsia="Arial" w:hAnsi="Arial"/>
-          <w:color w:val="1F2937"/>
-          <w:sz w:val="22"/>
-          <w:szCs w:val="22"/>
-        </w:rPr>
-        <w:t xml:space="preserve"> or </w:t>
+      </w:r>
+      <w:r>
+        <w:rPr>
+          <w:rFonts w:ascii="Arial" w:cs="Arial" w:eastAsia="Arial" w:hAnsi="Arial"/>
+          <w:color w:val="1F2937"/>
+          <w:sz w:val="22"/>
+          <w:szCs w:val="22"/>
+        </w:rPr>
       </w:r>
       <w:r>
         <w:rPr>
@@ -5036,16 +5028,14 @@
           <w:sz w:val="22"/>
           <w:szCs w:val="22"/>
         </w:rPr>
-        <w:t xml:space="preserve">Save for later</w:t>
-      </w:r>
-      <w:r>
-        <w:rPr>
-          <w:rFonts w:ascii="Arial" w:cs="Arial" w:eastAsia="Arial" w:hAnsi="Arial"/>
-          <w:color w:val="1F2937"/>
-          <w:sz w:val="22"/>
-          <w:szCs w:val="22"/>
-        </w:rPr>
-        <w:t xml:space="preserve">.</w:t>
+      </w:r>
+      <w:r>
+        <w:rPr>
+          <w:rFonts w:ascii="Arial" w:cs="Arial" w:eastAsia="Arial" w:hAnsi="Arial"/>
+          <w:color w:val="1F2937"/>
+          <w:sz w:val="22"/>
+          <w:szCs w:val="22"/>
+        </w:rPr>
       </w:r>
     </w:p>
     <w:p>
@@ -5309,7 +5299,7 @@
           <w:sz w:val="22"/>
           <w:szCs w:val="22"/>
         </w:rPr>
-        <w:t xml:space="preserve">Home shows your funnel: saved, applied, heard back, interviews and offers. Click a stage to see those jobs. </w:t>
+        <w:t>Home shows your funnel: saved, applied, heard back, interviews and offers. Click a stage to see those jobs. Under the greeting, a Today line shows interviews today or tomorrow, drafts waiting for Submit, and jobs to follow up: click one to open it. Next up shows your closest interview, how long to go, a Join call button when the email had a link, and About (the company) for a short brief. Needs you lists interview invites, tests and offers from your inbox: open the email, then click Done.</w:t>
       </w:r>
       <w:r>
         <w:rPr>
@@ -5320,16 +5310,14 @@
           <w:sz w:val="22"/>
           <w:szCs w:val="22"/>
         </w:rPr>
-        <w:t xml:space="preserve">Needs you</w:t>
-      </w:r>
-      <w:r>
-        <w:rPr>
-          <w:rFonts w:ascii="Arial" w:cs="Arial" w:eastAsia="Arial" w:hAnsi="Arial"/>
-          <w:color w:val="1F2937"/>
-          <w:sz w:val="22"/>
-          <w:szCs w:val="22"/>
-        </w:rPr>
-        <w:t xml:space="preserve"> lists interview invites, tests and offers from your inbox: open the email, then click Done. The inbox checks itself every few hours; </w:t>
+      </w:r>
+      <w:r>
+        <w:rPr>
+          <w:rFonts w:ascii="Arial" w:cs="Arial" w:eastAsia="Arial" w:hAnsi="Arial"/>
+          <w:color w:val="1F2937"/>
+          <w:sz w:val="22"/>
+          <w:szCs w:val="22"/>
+        </w:rPr>
       </w:r>
       <w:r>
         <w:rPr>
@@ -5340,16 +5328,14 @@
           <w:sz w:val="22"/>
           <w:szCs w:val="22"/>
         </w:rPr>
-        <w:t xml:space="preserve">Check email</w:t>
-      </w:r>
-      <w:r>
-        <w:rPr>
-          <w:rFonts w:ascii="Arial" w:cs="Arial" w:eastAsia="Arial" w:hAnsi="Arial"/>
-          <w:color w:val="1F2937"/>
-          <w:sz w:val="22"/>
-          <w:szCs w:val="22"/>
-        </w:rPr>
-        <w:t xml:space="preserve"> checks now.</w:t>
+      </w:r>
+      <w:r>
+        <w:rPr>
+          <w:rFonts w:ascii="Arial" w:cs="Arial" w:eastAsia="Arial" w:hAnsi="Arial"/>
+          <w:color w:val="1F2937"/>
+          <w:sz w:val="22"/>
+          <w:szCs w:val="22"/>
+        </w:rPr>
       </w:r>
     </w:p>
     <w:p>
@@ -5377,7 +5363,7 @@
           <w:sz w:val="22"/>
           <w:szCs w:val="22"/>
         </w:rPr>
-        <w:t>Calendar: when an interview email gives a date, it appears on the calendar by itself (marked "from your email"). Add one yourself with + Add interview, or press the small calendar button on an interview in Needs you. Click a day to see what is on it.</w:t>
+        <w:t>Calendar: when an interview email gives a date, it appears on the calendar by itself (marked "from your email"), with the call link, who you will meet and the round when the email says so. A reminder pops up an hour before (or at 8 in the morning if there is no time). Add one yourself with + Add interview, or press the small calendar button on an interview in Needs you. Click a day to see what is on it.</w:t>
       </w:r>
     </w:p>
     <w:p>
@@ -5391,7 +5377,7 @@
           <w:sz w:val="22"/>
           <w:szCs w:val="22"/>
         </w:rPr>
-        <w:t>Your last 7 days: below the funnel, a small summary shows applications sent (compared with the week before), replies, interviews or tests and offers, with a bar chart of the last 8 weeks. It also tells you when applications have had no reply for a week, so you can send a short follow-up.</w:t>
+        <w:t>Your last 7 days: below the funnel, a small summary shows applications sent (and how many the week before), replies, interviews or tests and offers, with a bar chart of the last 8 weeks. These numbers come from the same job cards as the boxes above, so they always agree. It also tells you when applications have had no reply for a week, so you can send a short follow-up.</w:t>
       </w:r>
     </w:p>
     <w:p>
@@ -5849,7 +5835,7 @@
           <w:sz w:val="22"/>
           <w:szCs w:val="22"/>
         </w:rPr>
-        <w:t>Settings, Appearance: choose a colour theme. Clean white (white pages with a charcoal side panel) is the default; Sand, Emerald, Slate and Mint are the others. Or press Ctrl+K (⌘K on Mac) and type "theme".</w:t>
+        <w:t>Settings, Appearance: choose a colour theme. Clean white (white pages with a charcoal side panel) is the default; Sand, Emerald, Slate and Mint are the others. Under Letters, pick the style of writing you like: Classic, Friendly, Elegant, Bold or Handwritten. Calm mode turns off the small animations. Or press Ctrl+K (⌘K on Mac) and type "theme".</w:t>
       </w:r>
     </w:p>
     <w:p>
@@ -8635,7 +8621,7 @@
         <w:sz w:val="18"/>
         <w:szCs w:val="18"/>
       </w:rPr>
-      <w:t>Harshitha's Career Hub · Guide (v2.8.1)</w:t>
+      <w:t>Harshitha's Career Hub · Guide (v3.0)</w:t>
     </w:r>
   </w:p>
 </w:hdr>

</xml_diff>

<commit_message>
Release 3.1: Resume page
- New Resume page: resume preview (PDF or the text job sites read, keywords
  highlighted), summary tiles, tabs Health / Fit to a job / Skills / Files
- resume_tools.py: ATS check, job keyword match, skills to build with free courses
- Your files moved from Profile to the Resume page, saved on change
- Claude rewrite suggestions for one job (ai_tailor)
- Filler: search-filter buttons are not taken for Next/Submit
- Docs: MAP.md, CLAUDE.md, user guide (docx + PDF) for 3.1; release.json signed

Co-Authored-By: Claude Opus 5.5 <noreply@anthropic.com>
</commit_message>
<xml_diff>
--- a/docs/Career_Hub_Guide.docx
+++ b/docs/Career_Hub_Guide.docx
@@ -2417,7 +2417,7 @@
           <w:sz w:val="22"/>
           <w:szCs w:val="22"/>
         </w:rPr>
-        <w:t xml:space="preserve">Scroll to Your files and drop your resume PDF onto the box (or click it to choose). It's picked as your resume automatically; click Save changes. Add a cover letter the same way if you have one.</w:t>
+        <w:t>Open Resume in the side bar, then the Files tab, and drop your resume PDF onto the box (or click it to choose). It's picked as your resume automatically and saved by itself. Add a cover letter the same way if you have one.</w:t>
       </w:r>
     </w:p>
     <w:p>
@@ -5703,6 +5703,119 @@
     </w:p>
     <w:p>
       <w:pPr>
+        <w:pStyle w:val="Heading3"/>
+        <w:keepNext/>
+        <w:spacing w:after="80" w:before="200"/>
+      </w:pPr>
+      <w:r>
+        <w:rPr>
+          <w:rFonts w:ascii="Arial" w:cs="Arial" w:eastAsia="Arial" w:hAnsi="Arial"/>
+          <w:b/>
+          <w:bCs/>
+          <w:color w:val="1F2937"/>
+          <w:sz w:val="24"/>
+          <w:szCs w:val="24"/>
+        </w:rPr>
+        <w:t>The Resume page</w:t>
+      </w:r>
+    </w:p>
+    <w:p>
+      <w:pPr>
+        <w:pStyle w:val="ListParagraph"/>
+        <w:numPr>
+          <w:ilvl w:val="0"/>
+          <w:numId w:val="3"/>
+        </w:numPr>
+        <w:spacing w:after="80" w:line="290"/>
+      </w:pPr>
+      <w:r>
+        <w:rPr>
+          <w:rFonts w:ascii="Arial" w:cs="Arial" w:eastAsia="Arial" w:hAnsi="Arial"/>
+          <w:color w:val="1F2937"/>
+          <w:sz w:val="22"/>
+          <w:szCs w:val="22"/>
+        </w:rPr>
+        <w:t>Your resume is on the left. As it looks shows the PDF; As job sites read it shows the text that application systems see, with marketing keywords highlighted. If that view is almost empty, job sites can't read your file: save it again as a PDF from Word or Google Docs.</w:t>
+      </w:r>
+    </w:p>
+    <w:p>
+      <w:pPr>
+        <w:pStyle w:val="ListParagraph"/>
+        <w:numPr>
+          <w:ilvl w:val="0"/>
+          <w:numId w:val="3"/>
+        </w:numPr>
+        <w:spacing w:after="80" w:line="290"/>
+      </w:pPr>
+      <w:r>
+        <w:rPr>
+          <w:rFonts w:ascii="Arial" w:cs="Arial" w:eastAsia="Arial" w:hAnsi="Arial"/>
+          <w:color w:val="1F2937"/>
+          <w:sz w:val="22"/>
+          <w:szCs w:val="22"/>
+        </w:rPr>
+        <w:t>Health gives a score out of 100 and a short list of what to fix, most important first (numbers in your results, a LinkedIn link, a skills heading and so on).</w:t>
+      </w:r>
+    </w:p>
+    <w:p>
+      <w:pPr>
+        <w:pStyle w:val="ListParagraph"/>
+        <w:numPr>
+          <w:ilvl w:val="0"/>
+          <w:numId w:val="3"/>
+        </w:numPr>
+        <w:spacing w:after="80" w:line="290"/>
+      </w:pPr>
+      <w:r>
+        <w:rPr>
+          <w:rFonts w:ascii="Arial" w:cs="Arial" w:eastAsia="Arial" w:hAnsi="Arial"/>
+          <w:color w:val="1F2937"/>
+          <w:sz w:val="22"/>
+          <w:szCs w:val="22"/>
+        </w:rPr>
+        <w:t>Fit to a job: paste a job link or the job text and press Check the fit. Red words are what the job asks for that your resume doesn't have yet; add the ones that are true for you. With the AI helper on, Suggest rewrites writes a new summary and better versions of your own lines.</w:t>
+      </w:r>
+    </w:p>
+    <w:p>
+      <w:pPr>
+        <w:pStyle w:val="ListParagraph"/>
+        <w:numPr>
+          <w:ilvl w:val="0"/>
+          <w:numId w:val="3"/>
+        </w:numPr>
+        <w:spacing w:after="80" w:line="290"/>
+      </w:pPr>
+      <w:r>
+        <w:rPr>
+          <w:rFonts w:ascii="Arial" w:cs="Arial" w:eastAsia="Arial" w:hAnsi="Arial"/>
+          <w:color w:val="1F2937"/>
+          <w:sz w:val="22"/>
+          <w:szCs w:val="22"/>
+        </w:rPr>
+        <w:t>Skills shows, for the roles you look for, which skills your resume already shows and which to build, each with a free course.</w:t>
+      </w:r>
+    </w:p>
+    <w:p>
+      <w:pPr>
+        <w:pStyle w:val="ListParagraph"/>
+        <w:numPr>
+          <w:ilvl w:val="0"/>
+          <w:numId w:val="3"/>
+        </w:numPr>
+        <w:spacing w:after="80" w:line="290"/>
+      </w:pPr>
+      <w:r>
+        <w:rPr>
+          <w:rFonts w:ascii="Arial" w:cs="Arial" w:eastAsia="Arial" w:hAnsi="Arial"/>
+          <w:color w:val="1F2937"/>
+          <w:sz w:val="22"/>
+          <w:szCs w:val="22"/>
+        </w:rPr>
+        <w:t>Files holds your resume, a second and third resume for other kinds of roles (with the job words that pick them), and your cover letter. Changes there save by themselves.</w:t>
+      </w:r>
+    </w:p>
+    <w:p>
+      <w:pPr>
         <w:pStyle w:val="Heading2"/>
         <w:keepNext/>
         <w:spacing w:after="100" w:before="280"/>
@@ -8621,7 +8734,7 @@
         <w:sz w:val="18"/>
         <w:szCs w:val="18"/>
       </w:rPr>
-      <w:t>Harshitha's Career Hub · Guide (v3.0)</w:t>
+      <w:t>Harshitha's Career Hub · Guide (v3.1)</w:t>
     </w:r>
   </w:p>
 </w:hdr>

</xml_diff>

<commit_message>
Release 3.3: Check your answers before they are filled in
A card lists every answer about to be typed on each page; she can fix
any, leave one empty, or turn it off in Settings, Applying.

Co-Authored-By: Claude Sonnet 5.5 <noreply@anthropic.com>
</commit_message>
<xml_diff>
--- a/docs/Career_Hub_Guide.docx
+++ b/docs/Career_Hub_Guide.docx
@@ -3727,6 +3727,25 @@
     </w:p>
     <w:p>
       <w:pPr>
+        <w:pStyle w:val="ListParagraph"/>
+        <w:numPr>
+          <w:ilvl w:val="0"/>
+          <w:numId w:val="3"/>
+        </w:numPr>
+        <w:spacing w:after="80" w:line="290"/>
+      </w:pPr>
+      <w:r>
+        <w:rPr>
+          <w:rFonts w:ascii="Arial" w:cs="Arial" w:eastAsia="Arial" w:hAnsi="Arial"/>
+          <w:color w:val="1F2937"/>
+          <w:sz w:val="22"/>
+          <w:szCs w:val="22"/>
+        </w:rPr>
+        <w:t>Before each page is filled, a Check before filling card lists every answer the app is about to type. Change anything that is wrong (your change is remembered), or tick Leave empty to skip one. Turn this off in Settings, Applying.</w:t>
+      </w:r>
+    </w:p>
+    <w:p>
+      <w:pPr>
         <w:spacing w:after="160" w:before="120"/>
         <w:jc w:val="center"/>
       </w:pPr>
@@ -8734,7 +8753,7 @@
         <w:sz w:val="18"/>
         <w:szCs w:val="18"/>
       </w:rPr>
-      <w:t>Harshitha's Career Hub · Guide (v3.1)</w:t>
+      <w:t>Harshitha's Career Hub · Guide (v3.3)</w:t>
     </w:r>
   </w:p>
 </w:hdr>

</xml_diff>

<commit_message>
Release 3.4: Tidier job list, free AI choices
Co-Authored-By: Claude Sonnet 5.5 <noreply@anthropic.com>
</commit_message>
<xml_diff>
--- a/docs/Career_Hub_Guide.docx
+++ b/docs/Career_Hub_Guide.docx
@@ -5261,6 +5261,25 @@
           <w:sz w:val="22"/>
           <w:szCs w:val="22"/>
         </w:rPr>
+        <w:t>On Find jobs, the alert-email links sit in their own box under your real jobs: press Show to open it. The Alert emails choice above the list shows all alerts, one site only, or none.</w:t>
+      </w:r>
+    </w:p>
+    <w:p>
+      <w:pPr>
+        <w:pStyle w:val="ListParagraph"/>
+        <w:numPr>
+          <w:ilvl w:val="0"/>
+          <w:numId w:val="5"/>
+        </w:numPr>
+        <w:spacing w:after="80" w:line="290"/>
+      </w:pPr>
+      <w:r>
+        <w:rPr>
+          <w:rFonts w:ascii="Arial" w:cs="Arial" w:eastAsia="Arial" w:hAnsi="Arial"/>
+          <w:color w:val="1F2937"/>
+          <w:sz w:val="22"/>
+          <w:szCs w:val="22"/>
+        </w:rPr>
         <w:t xml:space="preserve">Tick the ones you like and press Apply now or Save for later.</w:t>
       </w:r>
     </w:p>
@@ -6031,7 +6050,7 @@
           <w:sz w:val="20"/>
           <w:szCs w:val="20"/>
         </w:rPr>
-        <w:t xml:space="preserve">STEP 15  </w:t>
+        <w:t>STEP 15  AI helper (optional)</w:t>
       </w:r>
       <w:r>
         <w:rPr>
@@ -6042,7 +6061,6 @@
           <w:sz w:val="28"/>
           <w:szCs w:val="28"/>
         </w:rPr>
-        <w:t xml:space="preserve">AI helper (optional)</w:t>
       </w:r>
     </w:p>
     <w:p>
@@ -6061,7 +6079,7 @@
           <w:sz w:val="22"/>
           <w:szCs w:val="22"/>
         </w:rPr>
-        <w:t xml:space="preserve">Create an account at console.anthropic.com, add a little credit under Billing (pay as you go), then API keys, Create key, and copy it.</w:t>
+        <w:t>Settings, AI helper, Which AI to use: Free needs nothing and is already on. NVIDIA (free key) writes better: sign in free at build.nvidia.com, open any model, choose Get API key, and paste it in NVIDIA API key. Claude (paid): make a key at console.anthropic.com, add a little credit under Billing, and paste it in Claude API key.</w:t>
       </w:r>
     </w:p>
     <w:p>
@@ -6080,7 +6098,7 @@
           <w:sz w:val="22"/>
           <w:szCs w:val="22"/>
         </w:rPr>
-        <w:t xml:space="preserve">Paste it in Settings, AI helper and save. Written questions now get Draft with AI.</w:t>
+        <w:t>Free and NVIDIA send the job text and your resume text to an online AI service; Claude is paid. Written questions now get Draft with AI.</w:t>
       </w:r>
     </w:p>
     <w:p>
@@ -8753,7 +8771,7 @@
         <w:sz w:val="18"/>
         <w:szCs w:val="18"/>
       </w:rPr>
-      <w:t>Harshitha's Career Hub · Guide (v3.3)</w:t>
+      <w:t>Harshitha's Career Hub · Guide (v3.4)</w:t>
     </w:r>
   </w:p>
 </w:hdr>

</xml_diff>

<commit_message>
Release 3.5.0: Reach out to companies and agencies
New Reach out page: finds hiring emails (site, real browser, her Gmail), writes
personal mails with her resume, review / Gmail drafts / send, mail style options,
replies and other-channel log. Data schema 8.

Co-Authored-By: Claude Sonnet 5.5 <noreply@anthropic.com>
</commit_message>
<xml_diff>
--- a/docs/Career_Hub_Guide.docx
+++ b/docs/Career_Hub_Guide.docx
@@ -5854,6 +5854,50 @@
     </w:p>
     <w:p>
       <w:pPr>
+        <w:pStyle w:val="Heading3"/>
+      </w:pPr>
+      <w:r>
+        <w:t>Reach out: write to companies and agencies</w:t>
+      </w:r>
+    </w:p>
+    <w:p>
+      <w:pPr/>
+      <w:r>
+        <w:t>Reach out saves you the work of writing to hiring teams one by one. Open Reach out in the left pane.</w:t>
+      </w:r>
+    </w:p>
+    <w:p>
+      <w:pPr/>
+      <w:r>
+        <w:t>1. Paste company or agency websites, or email addresses, one per line, and press Find emails. The app looks for the hiring email on each site. A site with only a contact form has none: open its Contact link, copy an address, and type it in, or untick it. Add from my Gmail lists people who wrote to you and people you wrote to before.</w:t>
+      </w:r>
+    </w:p>
+    <w:p>
+      <w:pPr/>
+      <w:r>
+        <w:t>2. Choose what to do with the mails: read each one first (best), save them as Gmail drafts and send them yourself, or send straight away. The app writes one personal mail per company with your resume attached.</w:t>
+      </w:r>
+    </w:p>
+    <w:p>
+      <w:pPr/>
+      <w:r>
+        <w:t>3. Under How the mail should sound, choose the tone and length, the roles you want, what to always include and never include, and the subject line. Show me a sample mail lets you hear it first.</w:t>
+      </w:r>
+    </w:p>
+    <w:p>
+      <w:pPr/>
+      <w:r>
+        <w:t>The app sends at most 20 mails a day, with a short pause between each, and never writes to the same address twice. Every mail ends with a polite line that they can tell you if it is not relevant.</w:t>
+      </w:r>
+    </w:p>
+    <w:p>
+      <w:pPr/>
+      <w:r>
+        <w:t>How it is going shows how many mails you sent, who replied and who else wrote to you. If someone reached out another way (WhatsApp, LinkedIn, a phone call), write it down in Reached out another way.</w:t>
+      </w:r>
+    </w:p>
+    <w:p>
+      <w:pPr>
         <w:pStyle w:val="Heading2"/>
         <w:keepNext/>
         <w:spacing w:after="100" w:before="280"/>
@@ -8771,7 +8815,7 @@
         <w:sz w:val="18"/>
         <w:szCs w:val="18"/>
       </w:rPr>
-      <w:t>Harshitha's Career Hub · Guide (v3.4)</w:t>
+      <w:t>Harshitha's Career Hub · Guide (v3.5.0)</w:t>
     </w:r>
   </w:p>
 </w:hdr>

</xml_diff>